<commit_message>
Título da obra passa a "cidade mineradora"; versão 1.0.1
A chamada da Início já dizia "cidade mineradora", mas o resto do projeto —
README, .zenodo.json, CITATION.cff, texto.md, JSON-LD, publicacao.ts e os
títulos das figuras 1 e 14 — seguia com "cidade mineral". Uniformiza pela
forma nova, que é a que lê melhor em português.

As ocorrências de "cidade mineral" na bibliografia ficam como estão: são o
título e o resumo de Silva e Sousa (2022), obra de terceiros.

A seção de disponibilidade do artigo passa a citar só o DOI conceitual, que
resolve para a versão mais recente — assim o texto não precisa ser regerado a
cada release só para trocar o DOI da versão.

Co-Authored-By: Claude Opus 5 <noreply@anthropic.com>
</commit_message>
<xml_diff>
--- a/artigo/artigo.docx
+++ b/artigo/artigo.docx
@@ -7,7 +7,7 @@
         <w:pStyle w:val="TituloDoc"/>
       </w:pPr>
       <w:r>
-        <w:t xml:space="preserve">Da colônia agrícola à cidade mineral: urbanização, migração e mancha urbana em Canaã dos Carajás (PA), 1982–2026</w:t>
+        <w:t xml:space="preserve">Da colônia agrícola à cidade mineradora: urbanização, migração e mancha urbana em Canaã dos Carajás (PA), 1982–2026</w:t>
       </w:r>
     </w:p>
     <w:p>
@@ -121,7 +121,7 @@
         <w:pStyle w:val="Corpo"/>
       </w:pPr>
       <w:r>
-        <w:t xml:space="preserve">O artigo se organiza em sete seções. A seção 2 revisa a produção acadêmica sobre Canaã e identifica as lacunas que o estudo preenche. A seção 3 apresenta a área de estudo e a trajetória do assentamento à cidade mineral, com os marcos que estruturam toda a análise. A seção 4 descreve fontes, harmonização, estimação, controle de revelação e o pipeline de sensoriamento remoto, e declara as limitações. A seção 5 traz os resultados em nove blocos: população, mancha urbana, densidade e forma, coortes e origens dos migrantes, seletividade, inserção ocupacional e cadeia da mineração, condições domiciliares, desigualdade intraurbana e comparação regional. A seção 6 discute os achados à luz da literatura sobre cidades mineradoras e a seção 7 conclui.</w:t>
+        <w:t xml:space="preserve">O artigo se organiza em sete seções. A seção 2 revisa a produção acadêmica sobre Canaã e identifica as lacunas que o estudo preenche. A seção 3 apresenta a área de estudo e a trajetória do assentamento à cidade mineradora, com os marcos que estruturam toda a análise. A seção 4 descreve fontes, harmonização, estimação, controle de revelação e o pipeline de sensoriamento remoto, e declara as limitações. A seção 5 traz os resultados em nove blocos: população, mancha urbana, densidade e forma, coortes e origens dos migrantes, seletividade, inserção ocupacional e cadeia da mineração, condições domiciliares, desigualdade intraurbana e comparação regional. A seção 6 discute os achados à luz da literatura sobre cidades mineradoras e a seção 7 conclui.</w:t>
       </w:r>
     </w:p>
     <w:p>
@@ -26945,7 +26945,7 @@
         <w:pStyle w:val="Corpo"/>
       </w:pPr>
       <w:r>
-        <w:t xml:space="preserve">Os agregados publicados (estimativas aprovadas pelo controle de revelação, série da mancha urbana, indicadores por setor), o código do pipeline e do painel interativo e este artigo estão em https://canaa-urbana.github.io e no repositório https://github.com/canaa-urbana/canaa-urbana.github.io, arquivado no Zenodo (DOI: https://doi.org/10.5281/zenodo.22699960; versão 1.0.0: https://doi.org/10.5281/zenodo.22699961), com código sob licença MIT e dados e textos sob CC BY 4.0. Os microdados dos Censos Demográficos não são redistribuídos; os de 2022 são de acesso controlado do IBGE.</w:t>
+        <w:t xml:space="preserve">Os agregados publicados (estimativas aprovadas pelo controle de revelação, série da mancha urbana, indicadores por setor), o código do pipeline e do painel interativo e este artigo estão em https://canaa-urbana.github.io e no repositório https://github.com/canaa-urbana/canaa-urbana.github.io, arquivado no Zenodo (DOI conceitual, que resolve para a versão mais recente: https://doi.org/10.5281/zenodo.22699960; esta é a versão 1.0.1), com código sob licença MIT e dados e textos sob CC BY 4.0. Os microdados dos Censos Demográficos não são redistribuídos; os de 2022 são de acesso controlado do IBGE.</w:t>
       </w:r>
     </w:p>
     <w:p>
@@ -27643,7 +27643,7 @@
         <w:sz w:val="15"/>
         <w:szCs w:val="15"/>
       </w:rPr>
-      <w:t xml:space="preserve">Da colônia agrícola à cidade mineral: urbanização, migração e mancha urbana em Canaã dos Carajás (PA), 1982–2026</w:t>
+      <w:t xml:space="preserve">Da colônia agrícola à cidade mineradora: urbanização, migração e mancha urbana em Canaã dos Carajás (PA), 1982–2026</w:t>
     </w:r>
     <w:r>
       <w:t xml:space="preserve">	</w:t>

</xml_diff>